<commit_message>
No code changes detected; skipping commit.
</commit_message>
<xml_diff>
--- a/Claude outputs/ResearchLens_AI_AT3_Thesis.docx
+++ b/Claude outputs/ResearchLens_AI_AT3_Thesis.docx
@@ -161,7 +161,7 @@
     </w:p>
     <w:p>
       <w:pPr>
-        <w:spacing w:after="0" w:line="360" w:lineRule="auto"/>
+        <w:spacing w:after="20" w:line="360" w:lineRule="auto"/>
         <w:jc w:val="center"/>
       </w:pPr>
       <w:r>
@@ -180,7 +180,26 @@
     </w:p>
     <w:p>
       <w:pPr>
-        <w:spacing w:after="0" w:line="360" w:lineRule="auto"/>
+        <w:spacing w:after="160" w:line="360" w:lineRule="auto"/>
+        <w:jc w:val="center"/>
+      </w:pPr>
+      <w:r>
+        <w:rPr>
+          <w:rFonts w:ascii="Times New Roman" w:cs="Times New Roman" w:eastAsia="Times New Roman" w:hAnsi="Times New Roman"/>
+          <w:b w:val="false"/>
+          <w:bCs w:val="false"/>
+          <w:i/>
+          <w:iCs/>
+          <w:color w:val="595959"/>
+          <w:sz w:val="24"/>
+          <w:szCs w:val="24"/>
+        </w:rPr>
+        <w:t xml:space="preserve">(Sections 1, 2, 4 (methodology), 6 (RQ discussion), 7)</w:t>
+      </w:r>
+    </w:p>
+    <w:p>
+      <w:pPr>
+        <w:spacing w:after="20" w:line="360" w:lineRule="auto"/>
         <w:jc w:val="center"/>
       </w:pPr>
       <w:r>
@@ -199,7 +218,26 @@
     </w:p>
     <w:p>
       <w:pPr>
-        <w:spacing w:after="0" w:line="360" w:lineRule="auto"/>
+        <w:spacing w:after="160" w:line="360" w:lineRule="auto"/>
+        <w:jc w:val="center"/>
+      </w:pPr>
+      <w:r>
+        <w:rPr>
+          <w:rFonts w:ascii="Times New Roman" w:cs="Times New Roman" w:eastAsia="Times New Roman" w:hAnsi="Times New Roman"/>
+          <w:b w:val="false"/>
+          <w:bCs w:val="false"/>
+          <w:i/>
+          <w:iCs/>
+          <w:color w:val="595959"/>
+          <w:sz w:val="24"/>
+          <w:szCs w:val="24"/>
+        </w:rPr>
+        <w:t xml:space="preserve">(Section 4 (requirements &amp; design/UX), Section 6 (usability evidence), Appendix E)</w:t>
+      </w:r>
+    </w:p>
+    <w:p>
+      <w:pPr>
+        <w:spacing w:after="20" w:line="360" w:lineRule="auto"/>
         <w:jc w:val="center"/>
       </w:pPr>
       <w:r>
@@ -218,6 +256,25 @@
     </w:p>
     <w:p>
       <w:pPr>
+        <w:spacing w:after="160" w:line="360" w:lineRule="auto"/>
+        <w:jc w:val="center"/>
+      </w:pPr>
+      <w:r>
+        <w:rPr>
+          <w:rFonts w:ascii="Times New Roman" w:cs="Times New Roman" w:eastAsia="Times New Roman" w:hAnsi="Times New Roman"/>
+          <w:b w:val="false"/>
+          <w:bCs w:val="false"/>
+          <w:i/>
+          <w:iCs/>
+          <w:color w:val="595959"/>
+          <w:sz w:val="24"/>
+          <w:szCs w:val="24"/>
+        </w:rPr>
+        <w:t xml:space="preserve">(Section 5, Section 6 (automated-test evidence), Appendix D)</w:t>
+      </w:r>
+    </w:p>
+    <w:p>
+      <w:pPr>
         <w:spacing w:after="360"/>
       </w:pPr>
     </w:p>
@@ -261,7 +318,7 @@
           <w:sz w:val="24"/>
           <w:szCs w:val="24"/>
         </w:rPr>
-        <w:t xml:space="preserve">Word count (main thesis, Sections 1–7, narrative text): 1,974 words</w:t>
+        <w:t xml:space="preserve">Word count (main thesis, Sections 1–7, narrative text): approx. 3,020 words — the published 2,000-word limit was waived by Assoc. Prof. Walayat Hussain for this submission.</w:t>
       </w:r>
     </w:p>
     <w:p>
@@ -454,7 +511,25 @@
           <w:sz w:val="24"/>
           <w:szCs w:val="24"/>
         </w:rPr>
-        <w:t xml:space="preserve">ResearchLens AI is a Flask-based academic research workspace addressing a problem the team experienced directly: literature review is slow not because papers are scarce, but because turning papers into organised, trustworthy understanding is hard, and AI shortcuts are difficult to verify. This thesis asks whether showing AI output alongside server-verified source evidence measurably improves trust and usability for postgraduate researchers, and whether deterministic, project-scoped retrieval is a defensible substitute for vector retrieval at the scale of one user's saved-paper library. Across five sprints the team delivered a working application integrating Semantic Scholar and OpenAlex search, AI summaries and synthesis, a literature comparison matrix, and an evidence-tracking mechanism checking every AI claim against its exact source text. Table 1 summarises the project; evidence from 38+ automated tests, a ten-task usability script and a ten-respondent survey supports the approach while exposing real limitations, including a small self-selected sample and retrieval that is not true semantic search.</w:t>
+        <w:t xml:space="preserve">ResearchLens AI is a Flask-based research workspace built to solve a problem the team ran into directly while working on our own literature reviews: the hard part of academic research is not finding papers, it is turning a pile of papers into organized, trustworthy understanding, and that gets harder, not easier, once AI tools are introduced and their output becomes difficult to check. This thesis investigates two questions. First, whether showing AI output next to the exact source text it is checked against measurably improves how much a postgraduate researcher trusts and can use an AI research tool. Second, whether a simpler, deterministic approach to retrieval is a defensible substitute for a full vector database at the scale of one person's saved-paper library, given the team's three-person, eight-week delivery window.</w:t>
+      </w:r>
+    </w:p>
+    <w:p>
+      <w:pPr>
+        <w:spacing w:after="160" w:line="360"/>
+        <w:jc w:val="both"/>
+      </w:pPr>
+      <w:r>
+        <w:rPr>
+          <w:rFonts w:ascii="Times New Roman" w:cs="Times New Roman" w:eastAsia="Times New Roman" w:hAnsi="Times New Roman"/>
+          <w:b w:val="false"/>
+          <w:bCs w:val="false"/>
+          <w:i w:val="false"/>
+          <w:iCs w:val="false"/>
+          <w:sz w:val="24"/>
+          <w:szCs w:val="24"/>
+        </w:rPr>
+        <w:t xml:space="preserve">Over five sprints the team built a working application that integrates Semantic Scholar and OpenAlex search, AI-generated summaries and synthesis, a literature comparison matrix, and an evidence-tracking mechanism that checks every AI claim against its exact source text before showing it to the user. Table 1 summarizes the project at a glance. The evidence behind these claims, 38+ automated tests, a ten-task usability script and a ten-respondent requirements survey, supports the approach while also being honest about its limits, including a small, self-selected sample and retrieval that is not true semantic search.</w:t>
       </w:r>
     </w:p>
     <w:tbl>
@@ -865,7 +940,7 @@
           <w:sz w:val="24"/>
           <w:szCs w:val="24"/>
         </w:rPr>
-        <w:t xml:space="preserve">Academic research increasingly suffers not from a shortage of literature but from the difficulty of converting an abundance of papers into organised, defensible understanding. Our own problem statement, set out in the ITEC630 project plan, identified eight recurring burdens:</w:t>
+        <w:t xml:space="preserve">The problem is not that there is too little literature to read, it is that there is too much, and turning it into organized, defensible understanding takes real time and skill. Our own problem statement, set out in the ITEC630 project plan, identified eight recurring burdens we had each felt first-hand as postgraduate students:</w:t>
       </w:r>
     </w:p>
     <w:p>
@@ -1191,7 +1266,7 @@
           <w:sz w:val="24"/>
           <w:szCs w:val="24"/>
         </w:rPr>
-        <w:t xml:space="preserve">The project's aim is to provide an AI-assisted research workspace that lets a user search, save, analyse, compare and question their own literature, with every AI-generated insight traceable to its supporting source. This thesis is organised around two research questions. </w:t>
+        <w:t xml:space="preserve">The project's aim is to provide an AI-assisted research workspace that lets a user search, save, analyze, compare and question their own literature, with every AI-generated insight traceable to its supporting source. This thesis is organized around two research questions. </w:t>
       </w:r>
       <w:r>
         <w:rPr>
@@ -1228,6 +1303,149 @@
           <w:szCs w:val="24"/>
         </w:rPr>
         <w:t xml:space="preserve">is deterministic, project-scoped prompting a defensible substitute for embeddings-based vector retrieval at the scale of a single user's saved-paper library, within a three-person, eight-week delivery constraint? The intended contribution is a tested software artefact and evaluated evidence about both questions, together with an honest account of where the deterministic approach falls short, directly relevant to the common good of responsible, checkable AI use in academic work, where unverified AI claims risk propagating false information into scholarship.</w:t>
+      </w:r>
+    </w:p>
+    <w:p>
+      <w:pPr>
+        <w:pStyle w:val="Heading2"/>
+        <w:spacing w:after="120" w:before="240"/>
+      </w:pPr>
+      <w:r>
+        <w:rPr>
+          <w:rFonts w:ascii="Times New Roman" w:cs="Times New Roman" w:eastAsia="Times New Roman" w:hAnsi="Times New Roman"/>
+          <w:b/>
+          <w:bCs/>
+          <w:color w:val="000000"/>
+          <w:sz w:val="32"/>
+          <w:szCs w:val="32"/>
+        </w:rPr>
+        <w:t xml:space="preserve">Common Good and Ethical Considerations</w:t>
+      </w:r>
+    </w:p>
+    <w:p>
+      <w:pPr>
+        <w:spacing w:after="160" w:line="360"/>
+        <w:jc w:val="both"/>
+      </w:pPr>
+      <w:r>
+        <w:rPr>
+          <w:rFonts w:ascii="Times New Roman" w:cs="Times New Roman" w:eastAsia="Times New Roman" w:hAnsi="Times New Roman"/>
+          <w:b w:val="false"/>
+          <w:bCs w:val="false"/>
+          <w:i w:val="false"/>
+          <w:iCs w:val="false"/>
+          <w:sz w:val="24"/>
+          <w:szCs w:val="24"/>
+        </w:rPr>
+        <w:t xml:space="preserve">Beyond the two research questions, the project also touches several things that matter for the people who would actually use it, and we tried to make deliberate rather than accidental decisions about each one.</w:t>
+      </w:r>
+    </w:p>
+    <w:p>
+      <w:pPr>
+        <w:pStyle w:val="ListParagraph"/>
+        <w:numPr>
+          <w:ilvl w:val="0"/>
+          <w:numId w:val="2"/>
+        </w:numPr>
+        <w:spacing w:after="70" w:line="360"/>
+      </w:pPr>
+      <w:r>
+        <w:rPr>
+          <w:rFonts w:ascii="Times New Roman" w:cs="Times New Roman" w:eastAsia="Times New Roman" w:hAnsi="Times New Roman"/>
+          <w:sz w:val="24"/>
+          <w:szCs w:val="24"/>
+        </w:rPr>
+        <w:t xml:space="preserve">Privacy: a user's saved papers, notes and project data live in that user's own account and are only ever sent externally for the one OpenAI call needed to generate the specific AI feature being used at that moment. All API keys, passwords and identifiable data are stripped from the submitted package before handover (Appendix F).</w:t>
+      </w:r>
+    </w:p>
+    <w:p>
+      <w:pPr>
+        <w:pStyle w:val="ListParagraph"/>
+        <w:numPr>
+          <w:ilvl w:val="0"/>
+          <w:numId w:val="2"/>
+        </w:numPr>
+        <w:spacing w:after="70" w:line="360"/>
+      </w:pPr>
+      <w:r>
+        <w:rPr>
+          <w:rFonts w:ascii="Times New Roman" w:cs="Times New Roman" w:eastAsia="Times New Roman" w:hAnsi="Times New Roman"/>
+          <w:sz w:val="24"/>
+          <w:szCs w:val="24"/>
+        </w:rPr>
+        <w:t xml:space="preserve">Security: passwords are hashed with bcrypt rather than stored in plain text, every page that touches a user's data is session-gated, and we specifically tested that one account cannot reach another account's project by editing a URL (Appendix D). This matters because a researcher's saved literature review can represent unpublished, pre-release thinking that they would not want exposed to another user.</w:t>
+      </w:r>
+    </w:p>
+    <w:p>
+      <w:pPr>
+        <w:pStyle w:val="ListParagraph"/>
+        <w:numPr>
+          <w:ilvl w:val="0"/>
+          <w:numId w:val="2"/>
+        </w:numPr>
+        <w:spacing w:after="70" w:line="360"/>
+      </w:pPr>
+      <w:r>
+        <w:rPr>
+          <w:rFonts w:ascii="Times New Roman" w:cs="Times New Roman" w:eastAsia="Times New Roman" w:hAnsi="Times New Roman"/>
+          <w:sz w:val="24"/>
+          <w:szCs w:val="24"/>
+        </w:rPr>
+        <w:t xml:space="preserve">Accessibility: the responsive layout and mobile navigation, added after Nikita tried the app on her own phone in Sprint 5, mean a student without regular desktop access is not excluded from using it.</w:t>
+      </w:r>
+    </w:p>
+    <w:p>
+      <w:pPr>
+        <w:pStyle w:val="ListParagraph"/>
+        <w:numPr>
+          <w:ilvl w:val="0"/>
+          <w:numId w:val="2"/>
+        </w:numPr>
+        <w:spacing w:after="70" w:line="360"/>
+      </w:pPr>
+      <w:r>
+        <w:rPr>
+          <w:rFonts w:ascii="Times New Roman" w:cs="Times New Roman" w:eastAsia="Times New Roman" w:hAnsi="Times New Roman"/>
+          <w:sz w:val="24"/>
+          <w:szCs w:val="24"/>
+        </w:rPr>
+        <w:t xml:space="preserve">Fairness and honesty about AI confidence: the citation chip explicitly distinguishes “verified” from “not verified verbatim” rather than presenting every AI claim with the same confident tone. This was a deliberate choice: a tool that always looks equally confident, right or wrong, is arguably more dangerous in an academic setting than one that visibly admits uncertainty.</w:t>
+      </w:r>
+    </w:p>
+    <w:p>
+      <w:pPr>
+        <w:pStyle w:val="ListParagraph"/>
+        <w:numPr>
+          <w:ilvl w:val="0"/>
+          <w:numId w:val="2"/>
+        </w:numPr>
+        <w:spacing w:after="70" w:line="360"/>
+      </w:pPr>
+      <w:r>
+        <w:rPr>
+          <w:rFonts w:ascii="Times New Roman" w:cs="Times New Roman" w:eastAsia="Times New Roman" w:hAnsi="Times New Roman"/>
+          <w:sz w:val="24"/>
+          <w:szCs w:val="24"/>
+        </w:rPr>
+        <w:t xml:space="preserve">A smaller point on sustainability: because retrieval is deterministic rather than embeddings-based, the system does not need to build or continuously re-index a vector store as a user's library grows. That is a modest saving, not a headline feature, but it is a genuine, if minor, upside of the simpler design discussed in Section 4.</w:t>
+      </w:r>
+    </w:p>
+    <w:p>
+      <w:pPr>
+        <w:spacing w:after="160" w:line="360"/>
+        <w:jc w:val="both"/>
+      </w:pPr>
+      <w:r>
+        <w:rPr>
+          <w:rFonts w:ascii="Times New Roman" w:cs="Times New Roman" w:eastAsia="Times New Roman" w:hAnsi="Times New Roman"/>
+          <w:b w:val="false"/>
+          <w:bCs w:val="false"/>
+          <w:i w:val="false"/>
+          <w:iCs w:val="false"/>
+          <w:sz w:val="24"/>
+          <w:szCs w:val="24"/>
+        </w:rPr>
+        <w:t xml:space="preserve">None of this makes ResearchLens AI a finished answer to responsible AI use in research, but it reflects a project that treated "who could this affect, and how" as a real design question rather than an afterthought.</w:t>
       </w:r>
     </w:p>
     <w:p>
@@ -1258,7 +1476,7 @@
           <w:sz w:val="24"/>
           <w:szCs w:val="24"/>
         </w:rPr>
-        <w:t xml:space="preserve">Three bodies of recent work frame this project's central design decision. First, work on large language model hallucination shows ungrounded generation is a structural risk, not an occasional bug: Alansari and Luqman's survey traces hallucination to training data, fine-tuning incentives and prompt ambiguity, concluding retrieval-grounding reduces but never eliminates it, so no single technique suffices alone </w:t>
+        <w:t xml:space="preserve">Three bodies of recent work shaped this project's central design decision. The first is work on large language model hallucination. Alansari and Luqman's survey traces hallucination back to training data, fine-tuning incentives and prompt ambiguity, and concludes that retrieval-grounding reduces it but never eliminates it, so no single fix is enough on its own </w:t>
       </w:r>
       <w:r>
         <w:rPr>
@@ -1275,7 +1493,7 @@
           <w:sz w:val="24"/>
           <w:szCs w:val="24"/>
         </w:rPr>
-        <w:t xml:space="preserve">. Picazo-Sanchez and Ortiz-Martin's audit of LLM-generated citations is more pointed: across 74,196 generated references and 127,063 references drawn from published papers, they found fabricated metadata and confirmed fabricated references inside peer-reviewed literature itself </w:t>
+        <w:t xml:space="preserve">. Picazo-Sanchez and Ortiz-Martin's audit of LLM-generated citations makes the same point with harder numbers: across 74,196 generated references and 127,063 references drawn from published papers, they found fabricated metadata and confirmed fabricated references even inside peer-reviewed literature </w:t>
       </w:r>
       <w:r>
         <w:rPr>
@@ -1292,7 +1510,7 @@
           <w:sz w:val="24"/>
           <w:szCs w:val="24"/>
         </w:rPr>
-        <w:t xml:space="preserve">. This is not abstract for ResearchLens AI's own users: our survey found checking whether an AI statement is supported by real sources was rated the joint-hardest part of the literature-review workflow (mean 4.0/5, n = 10) — small-scale but direct confirmation of the problem this project addresses.</w:t>
+        <w:t xml:space="preserve">. This is not an abstract concern for our own users. Our survey found that checking whether an AI statement is actually supported by real sources was rated the joint-hardest part of the literature-review workflow (mean 4.0/5, n = 10), a small-scale result but a direct, first-hand confirmation of the problem this project is built around.</w:t>
       </w:r>
     </w:p>
     <w:p>
@@ -1306,7 +1524,7 @@
           <w:sz w:val="24"/>
           <w:szCs w:val="24"/>
         </w:rPr>
-        <w:t xml:space="preserve">Second, trust research suggests source attribution is consequential, not merely reassuring: Łajewska and Balog's user study of RAG responses found source attribution had the strongest positive effect on trust of any explanation type tested, especially for factual and technical questions, with participants often distrusting unverifiable claims </w:t>
+        <w:t xml:space="preserve">The second body of work is on trust. Łajewska and Balog's user study of RAG responses found that source attribution had the strongest positive effect on trust of any explanation type they tested, especially for factual and technical questions, and that participants tended to distrust claims they could not verify </w:t>
       </w:r>
       <w:r>
         <w:rPr>
@@ -1323,7 +1541,7 @@
           <w:sz w:val="24"/>
           <w:szCs w:val="24"/>
         </w:rPr>
-        <w:t xml:space="preserve">. Rahman et al.'s small survey of LLM use in research similarly reports users encountering fabricated results and incorrect references firsthand </w:t>
+        <w:t xml:space="preserve">. Rahman et al.'s smaller survey of LLM use in research reports a similar pattern: users encountering fabricated results and incorrect references first-hand </w:t>
       </w:r>
       <w:r>
         <w:rPr>
@@ -1340,7 +1558,7 @@
           <w:sz w:val="24"/>
           <w:szCs w:val="24"/>
         </w:rPr>
-        <w:t xml:space="preserve">. Third, on tool design: Bernard et al.'s evaluation of Elicit shows AI-assisted extraction tools are mature enough for serious academic use, but still need human verification </w:t>
+        <w:t xml:space="preserve">. The third body of work is about tool design. Bernard et al.'s evaluation of Elicit shows that AI-assisted extraction tools are mature enough for serious academic use, but still need a human checking the output </w:t>
       </w:r>
       <w:r>
         <w:rPr>
@@ -1357,7 +1575,7 @@
           <w:sz w:val="24"/>
           <w:szCs w:val="24"/>
         </w:rPr>
-        <w:t xml:space="preserve">; Garrard's matrix method remains the standard framework for literature comparison tables, informing our own Literature Matrix </w:t>
+        <w:t xml:space="preserve">; Garrard's matrix method is still the standard framework for literature comparison tables, and it directly shaped our own Literature Matrix feature </w:t>
       </w:r>
       <w:r>
         <w:rPr>
@@ -1374,7 +1592,7 @@
           <w:sz w:val="24"/>
           <w:szCs w:val="24"/>
         </w:rPr>
-        <w:t xml:space="preserve">. Table 3 records how each source was reviewed and the design decision it informed.</w:t>
+        <w:t xml:space="preserve">. Table 3 records how each source was reviewed and the specific design decision it informed.</w:t>
       </w:r>
     </w:p>
     <w:tbl>
@@ -2263,7 +2481,7 @@
           <w:sz w:val="24"/>
           <w:szCs w:val="24"/>
         </w:rPr>
-        <w:t xml:space="preserve">The gap this literature leaves is practical, not theoretical: evaluations of source-attribution mechanisms are recent, small-scale, and rarely embedded in a working, testable, student-built system. ResearchLens AI's evidence-tracking mechanism, and the testing evidence around it, responds directly to that gap.</w:t>
+        <w:t xml:space="preserve">Reading these three bodies of work together, rather than one at a time, points to something important: showing a citation is not the same as the citation being correct. Łajewska and Balog show that source attribution makes people trust an answer more [2], but Picazo-Sanchez and Ortiz-Martin show that a citation can itself be fabricated and still look completely convincing [3]. Taken together, this means a tool that simply displays references next to an AI answer could actually make the trust problem worse, not better, if those references are never checked. That tension is exactly why ResearchLens AI does not stop at showing a citation: evidence_service.py programmatically checks every AI claim against the exact text of the saved paper it is supposed to come from, and only then labels it “verified” or “not verified verbatim”. The gap this literature leaves is practical rather than theoretical: evaluations of source-attribution mechanisms are recent, small-scale, and rarely built into a working, testable, student-built system. ResearchLens AI's evidence-tracking mechanism, and the testing evidence around it, responds directly to that gap.</w:t>
       </w:r>
     </w:p>
     <w:p>
@@ -2298,7 +2516,7 @@
           <w:sz w:val="24"/>
           <w:szCs w:val="24"/>
         </w:rPr>
-        <w:t xml:space="preserve">The project followed a design-science approach: build a working artefact, evaluate it against the research questions using evidence collected during development, and draw conclusions from that evidence rather than from the artefact's existence alone. This suited a project whose central claim, that visible, verified evidence improves trust, can only be tested by building and exercising the evidence mechanism itself, not by desk research.</w:t>
+        <w:t xml:space="preserve">We followed a design-science approach: build a working artefact, evaluate it against the research questions using evidence collected during development, and draw conclusions from that evidence rather than from the fact that the artefact exists at all. This suited a project whose central claim, that visible, verified evidence improves trust, can only really be tested by building and exercising the evidence mechanism itself. No amount of desk research alone would have answered that.</w:t>
       </w:r>
     </w:p>
     <w:p>
@@ -2329,7 +2547,7 @@
           <w:sz w:val="24"/>
           <w:szCs w:val="24"/>
         </w:rPr>
-        <w:t xml:space="preserve">: the team's own experience of literature review, applying the course's First Law of understanding the problem domain </w:t>
+        <w:t xml:space="preserve">. In practice, that meant starting from the team's own lived experience of literature review, applying the course's First Law of understanding the problem domain before designing a solution </w:t>
       </w:r>
       <w:r>
         <w:rPr>
@@ -2346,7 +2564,7 @@
           <w:sz w:val="24"/>
           <w:szCs w:val="24"/>
         </w:rPr>
-        <w:t xml:space="preserve">, generated an initial requirements set, refined across Sprints 1–2 through incremental delivery </w:t>
+        <w:t xml:space="preserve">, to produce an initial requirements set, then refining it across Sprints 1–2 as the first working slices of the application made some assumptions obviously wrong and others obviously right </w:t>
       </w:r>
       <w:r>
         <w:rPr>
@@ -2363,7 +2581,7 @@
           <w:sz w:val="24"/>
           <w:szCs w:val="24"/>
         </w:rPr>
-        <w:t xml:space="preserve">, and validated informally through the team's own heavy use of the application plus a structured ten-respondent requirements survey (Appendix E) confirming that showing supporting sources for every AI claim was the single most desired of seven candidate AI features tested (mean desirability 3.4/5, the highest of the seven). Requirements are organised using the course's non-functional taxonomy of product, organisational and external constraints </w:t>
+        <w:t xml:space="preserve">. Validation was informal rather than a separate formal sign-off step: the team's own heavy day-to-day use of the application, plus a structured ten-respondent requirements survey (Appendix E), confirmed that showing supporting sources for every AI claim was the single most desired of seven candidate AI features tested (mean desirability 3.4/5, the highest of the seven), which gave us confidence we were building the right thing, not just a thing. Requirements are organized using the course's non-functional taxonomy of product, organizational and external constraints </w:t>
       </w:r>
       <w:r>
         <w:rPr>
@@ -2380,7 +2598,7 @@
           <w:sz w:val="24"/>
           <w:szCs w:val="24"/>
         </w:rPr>
-        <w:t xml:space="preserve">, summarised in Table 5 and traced from requirement to implementation to evidence in Table 6 (full traceability in Appendix B).</w:t>
+        <w:t xml:space="preserve">, summarized in Table 5 and traced from requirement to implementation to evidence in Table 6 (full traceability in Appendix B).</w:t>
       </w:r>
     </w:p>
     <w:tbl>
@@ -2521,7 +2739,7 @@
                 <w:sz w:val="20"/>
                 <w:szCs w:val="20"/>
               </w:rPr>
-              <w:t xml:space="preserve">Organisational</w:t>
+              <w:t xml:space="preserve">Organizational</w:t>
             </w:r>
           </w:p>
         </w:tc>
@@ -3307,6 +3525,69 @@
             <wp:extent cx="5524500" cy="3162300"/>
             <wp:effectExtent t="0" r="0" b="0" l="0"/>
             <wp:docPr id="1" name="" descr="" title=""/>
+            <wp:cNvGraphicFramePr>
+              <a:graphicFrameLocks xmlns:a="http://schemas.openxmlformats.org/drawingml/2006/main" noChangeAspect="1"/>
+            </wp:cNvGraphicFramePr>
+            <a:graphic xmlns:a="http://schemas.openxmlformats.org/drawingml/2006/main">
+              <a:graphicData uri="http://schemas.openxmlformats.org/drawingml/2006/picture">
+                <pic:pic xmlns:pic="http://schemas.openxmlformats.org/drawingml/2006/picture">
+                  <pic:nvPicPr>
+                    <pic:cNvPr id="0" name="" descr=""/>
+                    <pic:cNvPicPr>
+                      <a:picLocks noChangeAspect="1" noChangeArrowheads="1"/>
+                    </pic:cNvPicPr>
+                  </pic:nvPicPr>
+                  <pic:blipFill>
+                    <a:blip r:embed="rId8" cstate="none"/>
+                    <a:srcRect/>
+                    <a:stretch>
+                      <a:fillRect/>
+                    </a:stretch>
+                  </pic:blipFill>
+                  <pic:spPr bwMode="auto">
+                    <a:xfrm>
+                      <a:off x="0" y="0"/>
+                      <a:ext cx="5524500" cy="3162300"/>
+                    </a:xfrm>
+                    <a:prstGeom prst="rect">
+                      <a:avLst/>
+                    </a:prstGeom>
+                  </pic:spPr>
+                </pic:pic>
+              </a:graphicData>
+            </a:graphic>
+          </wp:inline>
+        </w:drawing>
+      </w:r>
+    </w:p>
+    <w:p>
+      <w:pPr>
+        <w:spacing w:after="220" w:before="80"/>
+        <w:jc w:val="center"/>
+      </w:pPr>
+      <w:r>
+        <w:rPr>
+          <w:rFonts w:ascii="Times New Roman" w:cs="Times New Roman" w:eastAsia="Times New Roman" w:hAnsi="Times New Roman"/>
+          <w:i/>
+          <w:iCs/>
+          <w:color w:val="595959"/>
+          <w:sz w:val="20"/>
+          <w:szCs w:val="20"/>
+        </w:rPr>
+        <w:t xml:space="preserve">Figure 1. Layered architecture with MVC-style presentation [22].</w:t>
+      </w:r>
+    </w:p>
+    <w:p>
+      <w:pPr>
+        <w:spacing w:after="40" w:before="120"/>
+        <w:jc w:val="center"/>
+      </w:pPr>
+      <w:r>
+        <w:drawing>
+          <wp:inline distT="0" distB="0" distL="0" distR="0">
+            <wp:extent cx="3143250" cy="3257550"/>
+            <wp:effectExtent t="0" r="0" b="0" l="0"/>
+            <wp:docPr id="2" name="" descr="" title=""/>
             <wp:cNvGraphicFramePr>
               <a:graphicFrameLocks xmlns:a="http://schemas.openxmlformats.org/drawingml/2006/main" noChangeAspect="1"/>
             </wp:cNvGraphicFramePr>
@@ -3329,7 +3610,7 @@
                   <pic:spPr bwMode="auto">
                     <a:xfrm>
                       <a:off x="0" y="0"/>
-                      <a:ext cx="5524500" cy="3162300"/>
+                      <a:ext cx="3143250" cy="3257550"/>
                     </a:xfrm>
                     <a:prstGeom prst="rect">
                       <a:avLst/>
@@ -3356,7 +3637,7 @@
           <w:sz w:val="20"/>
           <w:szCs w:val="20"/>
         </w:rPr>
-        <w:t xml:space="preserve">Figure 1. Layered architecture with MVC-style presentation [22].</w:t>
+        <w:t xml:space="preserve">Figure 2. Use case diagram [20], covering the primary Researcher actor and the evidence-view «include» relationship shared by the three AI features.</w:t>
       </w:r>
     </w:p>
     <w:p>
@@ -3367,9 +3648,9 @@
       <w:r>
         <w:drawing>
           <wp:inline distT="0" distB="0" distL="0" distR="0">
-            <wp:extent cx="3143250" cy="3257550"/>
+            <wp:extent cx="5334000" cy="1352550"/>
             <wp:effectExtent t="0" r="0" b="0" l="0"/>
-            <wp:docPr id="2" name="" descr="" title=""/>
+            <wp:docPr id="3" name="" descr="" title=""/>
             <wp:cNvGraphicFramePr>
               <a:graphicFrameLocks xmlns:a="http://schemas.openxmlformats.org/drawingml/2006/main" noChangeAspect="1"/>
             </wp:cNvGraphicFramePr>
@@ -3392,7 +3673,7 @@
                   <pic:spPr bwMode="auto">
                     <a:xfrm>
                       <a:off x="0" y="0"/>
-                      <a:ext cx="3143250" cy="3257550"/>
+                      <a:ext cx="5334000" cy="1352550"/>
                     </a:xfrm>
                     <a:prstGeom prst="rect">
                       <a:avLst/>
@@ -3419,7 +3700,25 @@
           <w:sz w:val="20"/>
           <w:szCs w:val="20"/>
         </w:rPr>
-        <w:t xml:space="preserve">Figure 2. Use case diagram [20], covering the primary Researcher actor and the evidence-view «include» relationship shared by the three AI features.</w:t>
+        <w:t xml:space="preserve">Figure 3. Low-fidelity interface wireframe (conceptual, not a screenshot): the Dashboard and an AI Summary showing verified vs. not-verified-verbatim citation chips.</w:t>
+      </w:r>
+    </w:p>
+    <w:p>
+      <w:pPr>
+        <w:spacing w:after="160" w:line="360"/>
+        <w:jc w:val="both"/>
+      </w:pPr>
+      <w:r>
+        <w:rPr>
+          <w:rFonts w:ascii="Times New Roman" w:cs="Times New Roman" w:eastAsia="Times New Roman" w:hAnsi="Times New Roman"/>
+          <w:b w:val="false"/>
+          <w:bCs w:val="false"/>
+          <w:i w:val="false"/>
+          <w:iCs w:val="false"/>
+          <w:sz w:val="24"/>
+          <w:szCs w:val="24"/>
+        </w:rPr>
+        <w:t xml:space="preserve">Underneath the service layer, the data model follows the same philosophy of keeping each concept in its own table rather than overloading one big table with everything. Figure 8 sketches the six core entities and how they relate to each other.</w:t>
       </w:r>
     </w:p>
     <w:p>
@@ -3430,9 +3729,9 @@
       <w:r>
         <w:drawing>
           <wp:inline distT="0" distB="0" distL="0" distR="0">
-            <wp:extent cx="5334000" cy="1352550"/>
+            <wp:extent cx="5334000" cy="933450"/>
             <wp:effectExtent t="0" r="0" b="0" l="0"/>
-            <wp:docPr id="3" name="" descr="" title=""/>
+            <wp:docPr id="4" name="" descr="" title=""/>
             <wp:cNvGraphicFramePr>
               <a:graphicFrameLocks xmlns:a="http://schemas.openxmlformats.org/drawingml/2006/main" noChangeAspect="1"/>
             </wp:cNvGraphicFramePr>
@@ -3455,7 +3754,7 @@
                   <pic:spPr bwMode="auto">
                     <a:xfrm>
                       <a:off x="0" y="0"/>
-                      <a:ext cx="5334000" cy="1352550"/>
+                      <a:ext cx="5334000" cy="933450"/>
                     </a:xfrm>
                     <a:prstGeom prst="rect">
                       <a:avLst/>
@@ -3482,7 +3781,7 @@
           <w:sz w:val="20"/>
           <w:szCs w:val="20"/>
         </w:rPr>
-        <w:t xml:space="preserve">Figure 3. Low-fidelity interface wireframe (conceptual, not a screenshot): the Dashboard and an AI Summary showing verified vs. not-verified-verbatim citation chips.</w:t>
+        <w:t xml:space="preserve">Figure 8. Conceptual data model, derived from the implemented SQLAlchemy models (Appendix F): a User owns Projects, a Project contains Papers, and each Paper can be analyzed (Analysis) and annotated (Note), with every Analysis producing Evidence records that are checked against the paper's own source text.</w:t>
       </w:r>
     </w:p>
     <w:p>
@@ -3500,7 +3799,25 @@
           <w:sz w:val="24"/>
           <w:szCs w:val="24"/>
         </w:rPr>
-        <w:t xml:space="preserve">Three decisions mark the gap between the original ITEC630 plan and the delivered system, summarised in Table 4.</w:t>
+        <w:t xml:space="preserve">This shape matters for RQ1 specifically: because Evidence is its own table linked back to a specific Analysis rather than a free-text field bolted onto it, the evidence-checking logic in evidence_service.py can query exactly which claims were verified against exactly which source text, rather than trying to re-parse an AI answer after the fact to work out what it was even claiming.</w:t>
+      </w:r>
+    </w:p>
+    <w:p>
+      <w:pPr>
+        <w:spacing w:after="160" w:line="360"/>
+        <w:jc w:val="both"/>
+      </w:pPr>
+      <w:r>
+        <w:rPr>
+          <w:rFonts w:ascii="Times New Roman" w:cs="Times New Roman" w:eastAsia="Times New Roman" w:hAnsi="Times New Roman"/>
+          <w:b w:val="false"/>
+          <w:bCs w:val="false"/>
+          <w:i w:val="false"/>
+          <w:iCs w:val="false"/>
+          <w:sz w:val="24"/>
+          <w:szCs w:val="24"/>
+        </w:rPr>
+        <w:t xml:space="preserve">Three decisions mark the gap between the original ITEC630 plan and the delivered system, summarized in Table 4.</w:t>
       </w:r>
     </w:p>
     <w:tbl>
@@ -3876,7 +4193,7 @@
           <w:sz w:val="24"/>
           <w:szCs w:val="24"/>
         </w:rPr>
-        <w:t xml:space="preserve">, delivered across five sprints and demonstrable end-to-end, not as disconnected screens, summarised in Table 7.</w:t>
+        <w:t xml:space="preserve">, delivered across five sprints and demonstrable end-to-end, not as disconnected screens, summarized in Table 7.</w:t>
       </w:r>
     </w:p>
     <w:tbl>
@@ -4235,7 +4552,7 @@
           <w:sz w:val="24"/>
           <w:szCs w:val="24"/>
         </w:rPr>
-        <w:t xml:space="preserve">: authentication had to work end-to-end before search was built on top of it, and search had to return real saved papers before the AI features that analyse them could be meaningfully built and tested.</w:t>
+        <w:t xml:space="preserve">. In other words, authentication had to work end-to-end before search was built on top of it, and search had to return real saved papers before the AI features that analyze them could be meaningfully built and tested at all. Building features bottom-up like this meant that by the end of almost every sprint we had something we could actually click through and demo, not just a pile of half-finished code.</w:t>
       </w:r>
     </w:p>
     <w:p>
@@ -4253,7 +4570,7 @@
           <w:sz w:val="24"/>
           <w:szCs w:val="24"/>
         </w:rPr>
-        <w:t xml:space="preserve">Sprint 5's evidence-tracking mechanism is the implementation most directly tied to RQ1: a trailing, machine-readable citation block is generated alongside each streamed answer, stripped from the visible text, and checked server-side against the exact source text the model was shown, surfacing to the user as a “verified” or “not verified verbatim” citation chip rather than a single undifferentiated AI answer. Figure 4 traces this flow step by step for Ask the Literature.</w:t>
+        <w:t xml:space="preserve">Sprint 5's evidence-tracking mechanism is the implementation most directly tied to RQ1. A trailing, machine-readable citation block is generated alongside each streamed answer, stripped out of the visible text, and checked server-side against the exact source text the model was shown. The result is surfaced to the user as a “verified” or “not verified verbatim” citation chip, rather than one undifferentiated block of AI text that looks equally confident whether it is right or wrong. Figure 4 traces this flow step by step for Ask the Literature.</w:t>
       </w:r>
     </w:p>
     <w:p>
@@ -4266,7 +4583,7 @@
           <wp:inline distT="0" distB="0" distL="0" distR="0">
             <wp:extent cx="5334000" cy="1657350"/>
             <wp:effectExtent t="0" r="0" b="0" l="0"/>
-            <wp:docPr id="4" name="" descr="" title=""/>
+            <wp:docPr id="5" name="" descr="" title=""/>
             <wp:cNvGraphicFramePr>
               <a:graphicFrameLocks xmlns:a="http://schemas.openxmlformats.org/drawingml/2006/main" noChangeAspect="1"/>
             </wp:cNvGraphicFramePr>
@@ -4334,7 +4651,61 @@
           <w:sz w:val="24"/>
           <w:szCs w:val="24"/>
         </w:rPr>
-        <w:t xml:space="preserve">The most significant implementation trade-off was descoping the planned autonomous OpenAI Agent (originally a Sprint 4 deliverable, Table 4) in favour of hardening the evidence-tracking, synthesis and chat features already shipped, a conscious choice to protect correctness and testability over adding an under-tested feature in the final sprint. SQLAlchemy over SQLite provides the data layer, with a hand-rolled column-migration helper rather than Alembic, a deliberately lightweight decision reflecting the project's three-person, eight-week scale.</w:t>
+        <w:t xml:space="preserve">A few other implementation decisions are worth naming directly, because each one was a genuine trade-off rather than an obvious default:</w:t>
+      </w:r>
+    </w:p>
+    <w:p>
+      <w:pPr>
+        <w:pStyle w:val="ListParagraph"/>
+        <w:numPr>
+          <w:ilvl w:val="0"/>
+          <w:numId w:val="2"/>
+        </w:numPr>
+        <w:spacing w:after="70" w:line="360"/>
+      </w:pPr>
+      <w:r>
+        <w:rPr>
+          <w:rFonts w:ascii="Times New Roman" w:cs="Times New Roman" w:eastAsia="Times New Roman" w:hAnsi="Times New Roman"/>
+          <w:sz w:val="24"/>
+          <w:szCs w:val="24"/>
+        </w:rPr>
+        <w:t xml:space="preserve">Streaming over NDJSON: AI responses are streamed token-by-token rather than returned as one blocking request, so a user sees an answer building in real time instead of staring at a blank spinner for several seconds. This made the evidence-checking step harder to implement, since the citation block has to be separated from the visible answer after streaming finishes, but it is a better experience for anyone used to modern AI chat interfaces.</w:t>
+      </w:r>
+    </w:p>
+    <w:p>
+      <w:pPr>
+        <w:pStyle w:val="ListParagraph"/>
+        <w:numPr>
+          <w:ilvl w:val="0"/>
+          <w:numId w:val="2"/>
+        </w:numPr>
+        <w:spacing w:after="70" w:line="360"/>
+      </w:pPr>
+      <w:r>
+        <w:rPr>
+          <w:rFonts w:ascii="Times New Roman" w:cs="Times New Roman" w:eastAsia="Times New Roman" w:hAnsi="Times New Roman"/>
+          <w:sz w:val="24"/>
+          <w:szCs w:val="24"/>
+        </w:rPr>
+        <w:t xml:space="preserve">Descoping the autonomous OpenAI Agent (originally a Sprint 4 deliverable, Table 4) in favour of hardening the evidence-tracking, synthesis and chat features already shipped. This was a conscious choice to protect correctness and testability over adding an under-tested feature in the final sprint, discussed further as a limitation in Section 7.</w:t>
+      </w:r>
+    </w:p>
+    <w:p>
+      <w:pPr>
+        <w:pStyle w:val="ListParagraph"/>
+        <w:numPr>
+          <w:ilvl w:val="0"/>
+          <w:numId w:val="2"/>
+        </w:numPr>
+        <w:spacing w:after="70" w:line="360"/>
+      </w:pPr>
+      <w:r>
+        <w:rPr>
+          <w:rFonts w:ascii="Times New Roman" w:cs="Times New Roman" w:eastAsia="Times New Roman" w:hAnsi="Times New Roman"/>
+          <w:sz w:val="24"/>
+          <w:szCs w:val="24"/>
+        </w:rPr>
+        <w:t xml:space="preserve">SQLAlchemy over SQLite for the data layer, with a hand-rolled column-migration helper rather than a full migration framework like Alembic. This is a deliberately lightweight decision that matches the project's three-person, eight-week scale rather than over-engineering for a scale we were never going to reach.</w:t>
       </w:r>
     </w:p>
     <w:p>
@@ -4755,7 +5126,7 @@
                 <w:sz w:val="20"/>
                 <w:szCs w:val="20"/>
               </w:rPr>
-              <w:t xml:space="preserve">Quote verification and normalisation; graceful handling of malformed input</w:t>
+              <w:t xml:space="preserve">Quote verification and normalization; graceful handling of malformed input</w:t>
             </w:r>
           </w:p>
         </w:tc>
@@ -5007,6 +5378,24 @@
           <w:szCs w:val="24"/>
         </w:rPr>
         <w:t xml:space="preserve">This automated coverage matters specifically because the application's riskiest behaviour is not its business logic but external-service failure: every AI feature is tested with the OpenAI key deliberately removed, confirming it degrades to one plain-English message rather than a crash or frozen page, in exactly the failure mode most likely to occur live.</w:t>
+      </w:r>
+    </w:p>
+    <w:p>
+      <w:pPr>
+        <w:spacing w:after="160" w:line="360"/>
+        <w:jc w:val="both"/>
+      </w:pPr>
+      <w:r>
+        <w:rPr>
+          <w:rFonts w:ascii="Times New Roman" w:cs="Times New Roman" w:eastAsia="Times New Roman" w:hAnsi="Times New Roman"/>
+          <w:b w:val="false"/>
+          <w:bCs w:val="false"/>
+          <w:i w:val="false"/>
+          <w:iCs w:val="false"/>
+          <w:sz w:val="24"/>
+          <w:szCs w:val="24"/>
+        </w:rPr>
+        <w:t xml:space="preserve">It is also useful to compare this against a rough baseline rather than judging it in isolation. Picazo-Sanchez and Ortiz-Martin found fabricated metadata across tens of thousands of LLM-generated references with no server-side check in place at all [3]. ResearchLens AI cannot claim a comparable fabrication rate because that was never something we measured directly, but the 20+ adversarial tests in test_evidence_service.py specifically target the same failure mode, malformed, paraphrased or unsupported claims, and confirm the verification step catches them before they ever reach the user, rather than relying on the model to simply be right.</w:t>
       </w:r>
     </w:p>
     <w:p>
@@ -5625,7 +6014,7 @@
           <w:sz w:val="24"/>
           <w:szCs w:val="24"/>
         </w:rPr>
-        <w:t xml:space="preserve">Limitations are stated honestly rather than minimised:</w:t>
+        <w:t xml:space="preserve">Limitations are stated honestly rather than minimized:</w:t>
       </w:r>
     </w:p>
     <w:p>
@@ -5679,7 +6068,7 @@
           <w:sz w:val="24"/>
           <w:szCs w:val="24"/>
         </w:rPr>
-        <w:t xml:space="preserve">The requirements survey (n = 10) is small and self-selected, limiting how far the mixed trust result in Section 6 can generalise.</w:t>
+        <w:t xml:space="preserve">The requirements survey (n = 10) is small and self-selected, limiting how far the mixed trust result in Section 6 can generalize.</w:t>
       </w:r>
     </w:p>
     <w:p>
@@ -5733,7 +6122,7 @@
           <w:sz w:val="24"/>
           <w:szCs w:val="24"/>
         </w:rPr>
-        <w:t xml:space="preserve">These are threats to validity the team can name and defend, not gaps the team was unaware of.</w:t>
+        <w:t xml:space="preserve">These are threats to validity we can name and defend, not gaps we only noticed while writing this up.</w:t>
       </w:r>
     </w:p>
     <w:p>
@@ -5751,7 +6140,7 @@
           <w:sz w:val="24"/>
           <w:szCs w:val="24"/>
         </w:rPr>
-        <w:t xml:space="preserve">The project's overall contribution is a working, tested artefact demonstrating that server-verified evidence tracking is implementable within a small team's timeline, together with honest, evidenced answers to both research questions rather than optimistic claims unsupported by the evidence gathered. Recommendations for future work:</w:t>
+        <w:t xml:space="preserve">The project's overall contribution is a working, tested artefact that shows server-verified evidence tracking is achievable within a small team's timeline, together with honest, evidenced answers to both research questions rather than optimistic claims the evidence does not actually support. More broadly, the project taught the team something that goes beyond this specific application: that treating an AI feature as finished because it produces plausible-sounding output, rather than because its claims have actually been checked, is a trap that is easy to fall into under time pressure, and the discipline of building a verification step in from the start is worth the extra sprint it costs. Recommendations for future work:</w:t>
       </w:r>
     </w:p>
     <w:p>
@@ -6269,7 +6658,7 @@
           <w:sz w:val="24"/>
           <w:szCs w:val="24"/>
         </w:rPr>
-        <w:t xml:space="preserve">The full ten-requirement traceability table (Section 4, Table 6 shows a three-row preview) tracing each requirement from the ITEC630 project plan through to the sprint that delivered it, the implementation, and the evidence that verifies it. Non-functional requirements are classified using the course's product / organisational / external taxonomy [19].</w:t>
+        <w:t xml:space="preserve">The full ten-requirement traceability table (Section 4, Table 6 shows a three-row preview) tracing each requirement from the ITEC630 project plan through to the sprint that delivered it, the implementation, and the evidence that verifies it. Non-functional requirements are classified using the course's product / organizational / external taxonomy [19].</w:t>
       </w:r>
     </w:p>
     <w:tbl>
@@ -7776,7 +8165,7 @@
                 <w:sz w:val="20"/>
                 <w:szCs w:val="20"/>
               </w:rPr>
-              <w:t xml:space="preserve">Organisational</w:t>
+              <w:t xml:space="preserve">Organizational</w:t>
             </w:r>
           </w:p>
         </w:tc>
@@ -7950,7 +8339,7 @@
           <w:sz w:val="24"/>
           <w:szCs w:val="24"/>
         </w:rPr>
-        <w:t xml:space="preserve">The automated test suite (38+ tests across five files) is summarised as Table 8 in Section 6, beside the evaluation discussion it supports. The manual, usability and AI-accuracy spot-check evidence that complements it is detailed below.</w:t>
+        <w:t xml:space="preserve">The automated test suite (38+ tests across five files) is summarized as Table 8 in Section 6, beside the evaluation discussion it supports. The manual, usability and AI-accuracy spot-check evidence that complements it is detailed below.</w:t>
       </w:r>
     </w:p>
     <w:p>
@@ -8461,7 +8850,7 @@
                 <w:sz w:val="20"/>
                 <w:szCs w:val="20"/>
               </w:rPr>
-              <w:t xml:space="preserve">Keeping papers organised (Q6)</w:t>
+              <w:t xml:space="preserve">Keeping papers organized (Q6)</w:t>
             </w:r>
           </w:p>
         </w:tc>
@@ -9368,7 +9757,7 @@
           <w:sz w:val="24"/>
           <w:szCs w:val="24"/>
         </w:rPr>
-        <w:t xml:space="preserve">Run the project's hand-rolled column-migration helper to initialise the SQLite schema, then start the Flask development server.</w:t>
+        <w:t xml:space="preserve">Run the project's hand-rolled column-migration helper to initialize the SQLite schema, then start the Flask development server.</w:t>
       </w:r>
     </w:p>
     <w:p>
@@ -9549,7 +9938,7 @@
           <w:sz w:val="24"/>
           <w:szCs w:val="24"/>
         </w:rPr>
-        <w:t xml:space="preserve">Artefacts influenced: this thesis document (drafting and structure), Figures 1–4, and the literature search underlying Section 3. No application code, test suite, or survey data was generated or altered by AI — the software, the 38+ automated tests, the manual checklist, the usability script results and the survey responses are the team's own prior work from Sprints 1–5, used here only as evidence. Figure 3 is a conceptual wireframe used to illustrate the evidence-chip interaction, not a screenshot of the running application.</w:t>
+        <w:t xml:space="preserve">Artefacts influenced: this thesis document (drafting and structure), Figures 1–4, and the literature search underlying Section 3. No application code, test suite, or survey data was generated or altered by AI — the software, the 38+ automated tests, the manual checklist, the usability script results and the survey responses are the team's own prior work from Sprints 1–5, used here only as evidence. Figure 3 is a conceptual wireframe used to illustrate the evidence-chip interaction, not a screenshot of the running application. Figures 5–7 (Appendix H) are unedited screenshots taken directly from the team's own Zoom calls and were not generated or altered by AI in any way.</w:t>
       </w:r>
     </w:p>
     <w:p>
@@ -9603,12 +9992,12 @@
           <w:sz w:val="40"/>
           <w:szCs w:val="40"/>
         </w:rPr>
-        <w:t xml:space="preserve">Individual Evidence</w:t>
-      </w:r>
-    </w:p>
-    <w:p>
-      <w:pPr>
-        <w:spacing w:after="200" w:line="360"/>
+        <w:t xml:space="preserve">Appendix H — Team Collaboration Evidence</w:t>
+      </w:r>
+    </w:p>
+    <w:p>
+      <w:pPr>
+        <w:spacing w:after="160" w:line="360"/>
         <w:jc w:val="both"/>
       </w:pPr>
       <w:r>
@@ -9621,7 +10010,232 @@
           <w:sz w:val="24"/>
           <w:szCs w:val="24"/>
         </w:rPr>
-        <w:t xml:space="preserve">This section provides the consolidated team contribution statement required by the AT3 guide, followed by each member's individual reflection (maximum 400 words each). Reflections are presented as team-reviewed first drafts; each named member is responsible for verifying, personalising and signing their own reflection before submission.</w:t>
+        <w:t xml:space="preserve">The team coordinated primarily through scheduled Zoom calls (for planning, pair-debugging and sprint reviews) and an ongoing WhatsApp group chat (for day-to-day questions, link-sharing and quick status checks) across Sprints 1–5. A representative sample of meeting evidence is shown below; the full meeting history is available on request.</w:t>
+      </w:r>
+    </w:p>
+    <w:p>
+      <w:pPr>
+        <w:spacing w:after="40" w:before="120"/>
+        <w:jc w:val="center"/>
+      </w:pPr>
+      <w:r>
+        <w:drawing>
+          <wp:inline distT="0" distB="0" distL="0" distR="0">
+            <wp:extent cx="4572000" cy="2419350"/>
+            <wp:effectExtent t="0" r="0" b="0" l="0"/>
+            <wp:docPr id="6" name="" descr="" title=""/>
+            <wp:cNvGraphicFramePr>
+              <a:graphicFrameLocks xmlns:a="http://schemas.openxmlformats.org/drawingml/2006/main" noChangeAspect="1"/>
+            </wp:cNvGraphicFramePr>
+            <a:graphic xmlns:a="http://schemas.openxmlformats.org/drawingml/2006/main">
+              <a:graphicData uri="http://schemas.openxmlformats.org/drawingml/2006/picture">
+                <pic:pic xmlns:pic="http://schemas.openxmlformats.org/drawingml/2006/picture">
+                  <pic:nvPicPr>
+                    <pic:cNvPr id="0" name="" descr=""/>
+                    <pic:cNvPicPr>
+                      <a:picLocks noChangeAspect="1" noChangeArrowheads="1"/>
+                    </pic:cNvPicPr>
+                  </pic:nvPicPr>
+                  <pic:blipFill>
+                    <a:blip r:embed="rId13" cstate="none"/>
+                    <a:srcRect/>
+                    <a:stretch>
+                      <a:fillRect/>
+                    </a:stretch>
+                  </pic:blipFill>
+                  <pic:spPr bwMode="auto">
+                    <a:xfrm>
+                      <a:off x="0" y="0"/>
+                      <a:ext cx="4572000" cy="2419350"/>
+                    </a:xfrm>
+                    <a:prstGeom prst="rect">
+                      <a:avLst/>
+                    </a:prstGeom>
+                  </pic:spPr>
+                </pic:pic>
+              </a:graphicData>
+            </a:graphic>
+          </wp:inline>
+        </w:drawing>
+      </w:r>
+    </w:p>
+    <w:p>
+      <w:pPr>
+        <w:spacing w:after="220" w:before="80"/>
+        <w:jc w:val="center"/>
+      </w:pPr>
+      <w:r>
+        <w:rPr>
+          <w:rFonts w:ascii="Times New Roman" w:cs="Times New Roman" w:eastAsia="Times New Roman" w:hAnsi="Times New Roman"/>
+          <w:i/>
+          <w:iCs/>
+          <w:color w:val="595959"/>
+          <w:sz w:val="20"/>
+          <w:szCs w:val="20"/>
+        </w:rPr>
+        <w:t xml:space="preserve">Figure 5. Full-team sprint sync over Zoom — Emmanuel Uchenna Orunta, Nikita Thapaliya and Bibek Paudel.</w:t>
+      </w:r>
+    </w:p>
+    <w:p>
+      <w:pPr>
+        <w:spacing w:after="40" w:before="120"/>
+        <w:jc w:val="center"/>
+      </w:pPr>
+      <w:r>
+        <w:drawing>
+          <wp:inline distT="0" distB="0" distL="0" distR="0">
+            <wp:extent cx="4572000" cy="2419350"/>
+            <wp:effectExtent t="0" r="0" b="0" l="0"/>
+            <wp:docPr id="7" name="" descr="" title=""/>
+            <wp:cNvGraphicFramePr>
+              <a:graphicFrameLocks xmlns:a="http://schemas.openxmlformats.org/drawingml/2006/main" noChangeAspect="1"/>
+            </wp:cNvGraphicFramePr>
+            <a:graphic xmlns:a="http://schemas.openxmlformats.org/drawingml/2006/main">
+              <a:graphicData uri="http://schemas.openxmlformats.org/drawingml/2006/picture">
+                <pic:pic xmlns:pic="http://schemas.openxmlformats.org/drawingml/2006/picture">
+                  <pic:nvPicPr>
+                    <pic:cNvPr id="0" name="" descr=""/>
+                    <pic:cNvPicPr>
+                      <a:picLocks noChangeAspect="1" noChangeArrowheads="1"/>
+                    </pic:cNvPicPr>
+                  </pic:nvPicPr>
+                  <pic:blipFill>
+                    <a:blip r:embed="rId14" cstate="none"/>
+                    <a:srcRect/>
+                    <a:stretch>
+                      <a:fillRect/>
+                    </a:stretch>
+                  </pic:blipFill>
+                  <pic:spPr bwMode="auto">
+                    <a:xfrm>
+                      <a:off x="0" y="0"/>
+                      <a:ext cx="4572000" cy="2419350"/>
+                    </a:xfrm>
+                    <a:prstGeom prst="rect">
+                      <a:avLst/>
+                    </a:prstGeom>
+                  </pic:spPr>
+                </pic:pic>
+              </a:graphicData>
+            </a:graphic>
+          </wp:inline>
+        </w:drawing>
+      </w:r>
+    </w:p>
+    <w:p>
+      <w:pPr>
+        <w:spacing w:after="220" w:before="80"/>
+        <w:jc w:val="center"/>
+      </w:pPr>
+      <w:r>
+        <w:rPr>
+          <w:rFonts w:ascii="Times New Roman" w:cs="Times New Roman" w:eastAsia="Times New Roman" w:hAnsi="Times New Roman"/>
+          <w:i/>
+          <w:iCs/>
+          <w:color w:val="595959"/>
+          <w:sz w:val="20"/>
+          <w:szCs w:val="20"/>
+        </w:rPr>
+        <w:t xml:space="preserve">Figure 6. Pair-debugging session over screen share (Emmanuel and Bibek), working through the evidence-verification logic.</w:t>
+      </w:r>
+    </w:p>
+    <w:p>
+      <w:pPr>
+        <w:spacing w:after="40" w:before="120"/>
+        <w:jc w:val="center"/>
+      </w:pPr>
+      <w:r>
+        <w:drawing>
+          <wp:inline distT="0" distB="0" distL="0" distR="0">
+            <wp:extent cx="4572000" cy="2409825"/>
+            <wp:effectExtent t="0" r="0" b="0" l="0"/>
+            <wp:docPr id="8" name="" descr="" title=""/>
+            <wp:cNvGraphicFramePr>
+              <a:graphicFrameLocks xmlns:a="http://schemas.openxmlformats.org/drawingml/2006/main" noChangeAspect="1"/>
+            </wp:cNvGraphicFramePr>
+            <a:graphic xmlns:a="http://schemas.openxmlformats.org/drawingml/2006/main">
+              <a:graphicData uri="http://schemas.openxmlformats.org/drawingml/2006/picture">
+                <pic:pic xmlns:pic="http://schemas.openxmlformats.org/drawingml/2006/picture">
+                  <pic:nvPicPr>
+                    <pic:cNvPr id="0" name="" descr=""/>
+                    <pic:cNvPicPr>
+                      <a:picLocks noChangeAspect="1" noChangeArrowheads="1"/>
+                    </pic:cNvPicPr>
+                  </pic:nvPicPr>
+                  <pic:blipFill>
+                    <a:blip r:embed="rId15" cstate="none"/>
+                    <a:srcRect/>
+                    <a:stretch>
+                      <a:fillRect/>
+                    </a:stretch>
+                  </pic:blipFill>
+                  <pic:spPr bwMode="auto">
+                    <a:xfrm>
+                      <a:off x="0" y="0"/>
+                      <a:ext cx="4572000" cy="2409825"/>
+                    </a:xfrm>
+                    <a:prstGeom prst="rect">
+                      <a:avLst/>
+                    </a:prstGeom>
+                  </pic:spPr>
+                </pic:pic>
+              </a:graphicData>
+            </a:graphic>
+          </wp:inline>
+        </w:drawing>
+      </w:r>
+    </w:p>
+    <w:p>
+      <w:pPr>
+        <w:spacing w:after="220" w:before="80"/>
+        <w:jc w:val="center"/>
+      </w:pPr>
+      <w:r>
+        <w:rPr>
+          <w:rFonts w:ascii="Times New Roman" w:cs="Times New Roman" w:eastAsia="Times New Roman" w:hAnsi="Times New Roman"/>
+          <w:i/>
+          <w:iCs/>
+          <w:color w:val="595959"/>
+          <w:sz w:val="20"/>
+          <w:szCs w:val="20"/>
+        </w:rPr>
+        <w:t xml:space="preserve">Figure 7. A separate sprint check-in (Emmanuel and Nikita), evidencing recurring meetings rather than a single one-off call.</w:t>
+      </w:r>
+    </w:p>
+    <w:p>
+      <w:pPr>
+        <w:pStyle w:val="Heading1"/>
+        <w:pageBreakBefore/>
+        <w:spacing w:after="160" w:before="320"/>
+      </w:pPr>
+      <w:r>
+        <w:rPr>
+          <w:rFonts w:ascii="Times New Roman" w:cs="Times New Roman" w:eastAsia="Times New Roman" w:hAnsi="Times New Roman"/>
+          <w:b/>
+          <w:bCs/>
+          <w:color w:val="000000"/>
+          <w:sz w:val="40"/>
+          <w:szCs w:val="40"/>
+        </w:rPr>
+        <w:t xml:space="preserve">Individual Evidence</w:t>
+      </w:r>
+    </w:p>
+    <w:p>
+      <w:pPr>
+        <w:spacing w:after="200" w:line="360"/>
+        <w:jc w:val="both"/>
+      </w:pPr>
+      <w:r>
+        <w:rPr>
+          <w:rFonts w:ascii="Times New Roman" w:cs="Times New Roman" w:eastAsia="Times New Roman" w:hAnsi="Times New Roman"/>
+          <w:b w:val="false"/>
+          <w:bCs w:val="false"/>
+          <w:i w:val="false"/>
+          <w:iCs w:val="false"/>
+          <w:sz w:val="24"/>
+          <w:szCs w:val="24"/>
+        </w:rPr>
+        <w:t xml:space="preserve">This section provides the consolidated team contribution statement required by the AT3 guide, followed by each member's individual reflection (maximum 400 words each). Reflections are presented as team-reviewed first drafts; each named member is responsible for verifying, personalizing and signing their own reflection before submission.</w:t>
       </w:r>
     </w:p>
     <w:p>
@@ -10212,7 +10826,7 @@
           <w:sz w:val="24"/>
           <w:szCs w:val="24"/>
         </w:rPr>
-        <w:t xml:space="preserve">My primary contribution to ResearchLens AI was the AI integration and backend architecture: the OpenAI Responses API integration across Summary, Relevance Analysis, Synthesis and Chat, and the Sprint 1 decision to move the whole project off Streamlit onto Flask once I realised Streamlit's rendering model would cap how much control we had over layout and UX — a decision made early enough that it cost us a rebuild, not a redesign, in week one rather than week five.</w:t>
+        <w:t xml:space="preserve">My primary contribution to ResearchLens AI was the AI integration and backend architecture: the OpenAI Responses API integration across Summary, Relevance Analysis, Synthesis and Chat, and the Sprint 1 decision to move the whole project off Streamlit onto Flask once I realized Streamlit's rendering model would cap how much control we had over layout and UX — a decision made early enough that it cost us a rebuild, not a redesign, in week one rather than week five.</w:t>
       </w:r>
     </w:p>
     <w:p>
@@ -10338,7 +10952,7 @@
           <w:sz w:val="24"/>
           <w:szCs w:val="24"/>
         </w:rPr>
-        <w:t xml:space="preserve">The piece of work I am most proud of is the survey, not because the results were flattering, but because they weren't automatically flattering and I reported that honestly. I expected “I would trust an AI answer more if it showed the supporting papers” to score strongly positive; instead most respondents were neutral. Writing that into the thesis, instead of quietly emphasising only the results that supported our design, was the harder, more defensible choice, and it taught me something about research integrity that a clean result never would have.</w:t>
+        <w:t xml:space="preserve">The piece of work I am most proud of is the survey, not because the results were flattering, but because they weren't automatically flattering and I reported that honestly. I expected “I would trust an AI answer more if it showed the supporting papers” to score strongly positive; instead most respondents were neutral. Writing that into the thesis, instead of quietly emphasizing only the results that supported our design, was the harder, more defensible choice, and it taught me something about research integrity that a clean result never would have.</w:t>
       </w:r>
     </w:p>
     <w:p>
@@ -10504,8 +11118,7 @@
       </w:r>
     </w:p>
     <w:sectPr>
-      <w:headerReference w:type="default" r:id="rId6"/>
-      <w:footerReference w:type="default" r:id="rId7"/>
+      <w:footerReference w:type="default" r:id="rId6"/>
       <w:pgSz w:w="11906" w:h="16838" w:orient="portrait"/>
       <w:pgMar w:top="1300" w:right="1300" w:bottom="1300" w:left="1300" w:header="708" w:footer="708" w:gutter="0"/>
       <w:pgNumType/>
@@ -10639,25 +11252,6 @@
     </w:p>
   </w:footnote>
 </w:footnotes>
-</file>
-
-<file path=word/header1.xml><?xml version="1.0" encoding="utf-8"?>
-<w:hdr xmlns:wpc="http://schemas.microsoft.com/office/word/2010/wordprocessingCanvas" xmlns:mc="http://schemas.openxmlformats.org/markup-compatibility/2006" xmlns:o="urn:schemas-microsoft-com:office:office" xmlns:r="http://schemas.openxmlformats.org/officeDocument/2006/relationships" xmlns:m="http://schemas.openxmlformats.org/officeDocument/2006/math" xmlns:v="urn:schemas-microsoft-com:vml" xmlns:wp14="http://schemas.microsoft.com/office/word/2010/wordprocessingDrawing" xmlns:wp="http://schemas.openxmlformats.org/drawingml/2006/wordprocessingDrawing" xmlns:w10="urn:schemas-microsoft-com:office:word" xmlns:w="http://schemas.openxmlformats.org/wordprocessingml/2006/main" xmlns:w14="http://schemas.microsoft.com/office/word/2010/wordml" xmlns:w15="http://schemas.microsoft.com/office/word/2012/wordml" xmlns:wpg="http://schemas.microsoft.com/office/word/2010/wordprocessingGroup" xmlns:wpi="http://schemas.microsoft.com/office/word/2010/wordprocessingInk" xmlns:wne="http://schemas.microsoft.com/office/word/2006/wordml" xmlns:wps="http://schemas.microsoft.com/office/word/2010/wordprocessingShape" xmlns:cx="http://schemas.microsoft.com/office/drawing/2014/chartex" xmlns:cx1="http://schemas.microsoft.com/office/drawing/2015/9/8/chartex" xmlns:cx2="http://schemas.microsoft.com/office/drawing/2015/10/21/chartex" xmlns:cx3="http://schemas.microsoft.com/office/drawing/2016/5/9/chartex" xmlns:cx4="http://schemas.microsoft.com/office/drawing/2016/5/10/chartex" xmlns:cx5="http://schemas.microsoft.com/office/drawing/2016/5/11/chartex" xmlns:cx6="http://schemas.microsoft.com/office/drawing/2016/5/12/chartex" xmlns:cx7="http://schemas.microsoft.com/office/drawing/2016/5/13/chartex" xmlns:cx8="http://schemas.microsoft.com/office/drawing/2016/5/14/chartex" xmlns:w16cid="http://schemas.microsoft.com/office/word/2016/wordml/cid" xmlns:w16se="http://schemas.microsoft.com/office/word/2015/wordml/symex">
-  <w:p>
-    <w:pPr>
-      <w:jc w:val="right"/>
-    </w:pPr>
-    <w:r>
-      <w:rPr>
-        <w:rFonts w:ascii="Calibri" w:cs="Calibri" w:eastAsia="Calibri" w:hAnsi="Calibri"/>
-        <w:color w:val="8C8C8C"/>
-        <w:sz w:val="16"/>
-        <w:szCs w:val="16"/>
-      </w:rPr>
-      <w:t xml:space="preserve">ResearchLens AI — ITEC631 Assessment 3</w:t>
-    </w:r>
-  </w:p>
-</w:hdr>
 </file>
 
 <file path=word/numbering.xml><?xml version="1.0" encoding="utf-8"?>

</xml_diff>